<commit_message>
Add IQR sensor outlier features
</commit_message>
<xml_diff>
--- a/docs/Pipeline_Risk_Project_Guide.docx
+++ b/docs/Pipeline_Risk_Project_Guide.docx
@@ -214,7 +214,7 @@
                 <w:b w:val="0"/>
                 <w:sz w:val="18"/>
               </w:rPr>
-              <w:t>Rolling pressure, flow, temperature, pump-speed, and energy statistics; gradients; anomaly indexes; state-change flags.</w:t>
+              <w:t>Rolling pressure, flow, temperature, pump-speed, and energy statistics; gradients; anomaly indexes; state-change flags; and IQR sensor-outlier flags.</w:t>
             </w:r>
           </w:p>
         </w:tc>
@@ -1497,6 +1497,11 @@
       </w:r>
     </w:p>
     <w:p>
+      <w:r>
+        <w:t>The model now also calculates IQR outlier flags for pressure, flow, temperature, pump speed, and energy consumption. The bounds are learned from the training period using the usual 1.5 × IQR rule and reused during prediction. These flags help identify unusual sensor behavior; they are not proof of a leak and do not directly set the Normal, Warning, or Critical alert thresholds.</w:t>
+      </w:r>
+    </w:p>
+    <w:p>
       <w:pPr>
         <w:pStyle w:val="Heading1"/>
       </w:pPr>
@@ -1801,7 +1806,7 @@
                 <w:b w:val="0"/>
                 <w:sz w:val="18"/>
               </w:rPr>
-              <w:t>Engineered model features</w:t>
+              <w:t>Engineered model features after retraining</w:t>
             </w:r>
           </w:p>
         </w:tc>
@@ -1817,7 +1822,7 @@
                 <w:b w:val="0"/>
                 <w:sz w:val="18"/>
               </w:rPr>
-              <w:t>67</w:t>
+              <w:t>72</w:t>
             </w:r>
           </w:p>
         </w:tc>

</xml_diff>

<commit_message>
Repair sample timestamp collisions
</commit_message>
<xml_diff>
--- a/docs/Pipeline_Risk_Project_Guide.docx
+++ b/docs/Pipeline_Risk_Project_Guide.docx
@@ -531,7 +531,41 @@
                 <w:b w:val="0"/>
                 <w:sz w:val="18"/>
               </w:rPr>
-              <w:t>Canonical SCADA input dataset.</w:t>
+              <w:t>Original source SCADA sample, preserved for provenance.</w:t>
+            </w:r>
+          </w:p>
+        </w:tc>
+      </w:tr>
+      <w:tr>
+        <w:tc>
+          <w:tcPr>
+            <w:tcW w:type="dxa" w:w="5040"/>
+            <w:vAlign w:val="center"/>
+          </w:tcPr>
+          <w:p>
+            <w:r/>
+            <w:r>
+              <w:rPr>
+                <w:b w:val="0"/>
+                <w:sz w:val="18"/>
+              </w:rPr>
+              <w:t>data/processed/</w:t>
+            </w:r>
+          </w:p>
+        </w:tc>
+        <w:tc>
+          <w:tcPr>
+            <w:tcW w:type="dxa" w:w="5040"/>
+            <w:vAlign w:val="center"/>
+          </w:tcPr>
+          <w:p>
+            <w:r/>
+            <w:r>
+              <w:rPr>
+                <w:b w:val="0"/>
+                <w:sz w:val="18"/>
+              </w:rPr>
+              <w:t>Collision-repaired sample used by the local demo model.</w:t>
             </w:r>
           </w:p>
         </w:tc>
@@ -1924,7 +1958,7 @@
                 <w:b w:val="0"/>
                 <w:sz w:val="18"/>
               </w:rPr>
-              <w:t>0.9938</w:t>
+              <w:t>0.9926</w:t>
             </w:r>
           </w:p>
         </w:tc>
@@ -1992,7 +2026,7 @@
                 <w:b w:val="0"/>
                 <w:sz w:val="18"/>
               </w:rPr>
-              <w:t>0.876</w:t>
+              <w:t>0.892</w:t>
             </w:r>
           </w:p>
         </w:tc>
@@ -2001,7 +2035,7 @@
     <w:p/>
     <w:p>
       <w:r>
-        <w:t>These metrics come from the current sample dataset and should not be presented as Titas production accuracy. The sample also has 270 collision groups involving 678 rows with repeated segment timestamps. Training now stops by default until those timestamps are repaired or explicitly reviewed.</w:t>
+        <w:t>These metrics come from the current sample dataset and should not be presented as Titas production accuracy. The original sample had 270 collision groups involving 678 rows with repeated segment timestamps. The processed demo copy now preserves all rows and applies documented one-second offsets within each collision group; this is a synthetic-data repair, not a substitute for a real historian sequence field.</w:t>
       </w:r>
     </w:p>
     <w:p>
@@ -2034,7 +2068,15 @@
           <w:rFonts w:ascii="Consolas" w:hAnsi="Consolas"/>
           <w:sz w:val="18"/>
         </w:rPr>
-        <w:t>py scripts\audit_data.py</w:t>
+        <w:t>py scripts\repair_sample_timestamps.py</w:t>
+        <w:br/>
+      </w:r>
+      <w:r>
+        <w:rPr>
+          <w:rFonts w:ascii="Consolas" w:hAnsi="Consolas"/>
+          <w:sz w:val="18"/>
+        </w:rPr>
+        <w:t>py scripts\audit_data.py --data data\processed\scada_pipeline_repaired.csv</w:t>
         <w:br/>
       </w:r>
       <w:r>
@@ -2061,7 +2103,7 @@
     </w:p>
     <w:p>
       <w:r>
-        <w:t>To train a new model, repair the timestamp collisions first, then run py scripts\train_model.py. The command intentionally refuses ambiguous chronology by default.</w:t>
+        <w:t>To train a new model, run the sample repair script first, then run py scripts\train_model.py. For real Titas data, use the historian's true sequence or timestamp instead of the sample repair rule.</w:t>
       </w:r>
     </w:p>
     <w:p>

</xml_diff>